<commit_message>
docs: add core domain entities, database persistence, and documentation for VinDining backend and use cases
</commit_message>
<xml_diff>
--- a/docs/phase1/Báo cáo/BAO_CAO_KHAO_SAT_HE_THONG_VINDINING.docx
+++ b/docs/phase1/Báo cáo/BAO_CAO_KHAO_SAT_HE_THONG_VINDINING.docx
@@ -6593,16 +6593,26 @@
                 <w:sz w:val="28"/>
                 <w:szCs w:val="36"/>
               </w:rPr>
-              <w:t>19</w:t>
-            </w:r>
-            <w:r>
-              <w:rPr>
-                <w:rFonts w:cs="Times New Roman"/>
-                <w:color w:val="000000" w:themeColor="text1"/>
-                <w:sz w:val="28"/>
-                <w:szCs w:val="36"/>
-              </w:rPr>
-              <w:t xml:space="preserve"> Cơ chế giao tiếp thời gian thực</w:t>
+              <w:t>9</w:t>
+            </w:r>
+            <w:r>
+              <w:rPr>
+                <w:rFonts w:cs="Times New Roman"/>
+                <w:color w:val="000000" w:themeColor="text1"/>
+                <w:sz w:val="28"/>
+                <w:szCs w:val="36"/>
+                <w:lang w:val="vi-VN"/>
+              </w:rPr>
+              <w:t xml:space="preserve">. </w:t>
+            </w:r>
+            <w:r>
+              <w:rPr>
+                <w:rFonts w:cs="Times New Roman"/>
+                <w:color w:val="000000" w:themeColor="text1"/>
+                <w:sz w:val="28"/>
+                <w:szCs w:val="36"/>
+              </w:rPr>
+              <w:t>Cơ chế giao tiếp thời gian thực</w:t>
             </w:r>
           </w:p>
         </w:tc>

</xml_diff>